<commit_message>
BRD-01 New Business set v2.0 built with the UX documents 07 to 09 (interim, before the final screenshots)
</commit_message>
<xml_diff>
--- a/docs/deliverables/out/Drop-1_Transactional/BRD-01_New_Business/00_BIBS_StartHere_BRD-01_New_Business_v2.0.docx
+++ b/docs/deliverables/out/Drop-1_Transactional/BRD-01_New_Business/00_BIBS_StartHere_BRD-01_New_Business_v2.0.docx
@@ -18,7 +18,7 @@
               <a:graphicData uri="http://schemas.openxmlformats.org/drawingml/2006/picture">
                 <pic:pic>
                   <pic:nvPicPr>
-                    <pic:cNvPr id="0" name="bdo-insure.png"/>
+                    <pic:cNvPr id="0" name="client-logo.png"/>
                     <pic:cNvPicPr/>
                   </pic:nvPicPr>
                   <pic:blipFill>
@@ -7304,7 +7304,7 @@
             <a:graphicData uri="http://schemas.openxmlformats.org/drawingml/2006/picture">
               <pic:pic>
                 <pic:nvPicPr>
-                  <pic:cNvPr id="0" name="bdo-insure.png"/>
+                  <pic:cNvPr id="0" name="client-logo.png"/>
                   <pic:cNvPicPr/>
                 </pic:nvPicPr>
                 <pic:blipFill>

</xml_diff>

<commit_message>
BRD-01 New Business set v2.0 rebuilt on the retaken screenshots: 00 to 05 and the UX documents 07 to 09; drop indexes
</commit_message>
<xml_diff>
--- a/docs/deliverables/out/Drop-1_Transactional/BRD-01_New_Business/00_BIBS_StartHere_BRD-01_New_Business_v2.0.docx
+++ b/docs/deliverables/out/Drop-1_Transactional/BRD-01_New_Business/00_BIBS_StartHere_BRD-01_New_Business_v2.0.docx
@@ -333,7 +333,7 @@
                 <w:color w:val="2E2E2E"/>
                 <w:sz w:val="20"/>
               </w:rPr>
-              <w:t>27 September 2026</w:t>
+              <w:t>1 October 2026</w:t>
             </w:r>
           </w:p>
         </w:tc>
@@ -754,7 +754,7 @@
               <w:rPr>
                 <w:sz w:val="18"/>
               </w:rPr>
-              <w:t>27 Sep 2026</w:t>
+              <w:t>1 Oct 2026</w:t>
             </w:r>
           </w:p>
         </w:tc>
@@ -2431,6 +2431,280 @@
           </w:p>
         </w:tc>
       </w:tr>
+      <w:tr>
+        <w:tc>
+          <w:tcPr>
+            <w:tcW w:type="dxa" w:w="2946"/>
+            <w:tcMar>
+              <w:top w:w="50" w:type="dxa"/>
+              <w:bottom w:w="50" w:type="dxa"/>
+              <w:left w:w="90" w:type="dxa"/>
+              <w:right w:w="90" w:type="dxa"/>
+            </w:tcMar>
+          </w:tcPr>
+          <w:p>
+            <w:pPr>
+              <w:pStyle w:val="BDOITable"/>
+            </w:pPr>
+            <w:r>
+              <w:rPr>
+                <w:sz w:val="15"/>
+              </w:rPr>
+              <w:t>07_BIBS_UXDeck_BRD-01_New_Business_v2.0.pptx</w:t>
+            </w:r>
+          </w:p>
+        </w:tc>
+        <w:tc>
+          <w:tcPr>
+            <w:tcW w:type="dxa" w:w="3626"/>
+            <w:tcMar>
+              <w:top w:w="50" w:type="dxa"/>
+              <w:bottom w:w="50" w:type="dxa"/>
+              <w:left w:w="90" w:type="dxa"/>
+              <w:right w:w="90" w:type="dxa"/>
+            </w:tcMar>
+          </w:tcPr>
+          <w:p>
+            <w:pPr>
+              <w:pStyle w:val="BDOITable"/>
+            </w:pPr>
+            <w:r>
+              <w:rPr>
+                <w:sz w:val="15"/>
+              </w:rPr>
+              <w:t>UX Screen Deck for the BDOI UX Design team: design foundation, navigation and personas, every walkthrough step by step and every screen with all its states</w:t>
+            </w:r>
+          </w:p>
+        </w:tc>
+        <w:tc>
+          <w:tcPr>
+            <w:tcW w:type="dxa" w:w="1926"/>
+            <w:tcMar>
+              <w:top w:w="50" w:type="dxa"/>
+              <w:bottom w:w="50" w:type="dxa"/>
+              <w:left w:w="90" w:type="dxa"/>
+              <w:right w:w="90" w:type="dxa"/>
+            </w:tcMar>
+          </w:tcPr>
+          <w:p>
+            <w:pPr>
+              <w:pStyle w:val="BDOITable"/>
+            </w:pPr>
+            <w:r>
+              <w:rPr>
+                <w:sz w:val="15"/>
+              </w:rPr>
+              <w:t>BDOI UX Design team</w:t>
+            </w:r>
+          </w:p>
+        </w:tc>
+        <w:tc>
+          <w:tcPr>
+            <w:tcW w:type="dxa" w:w="1473"/>
+            <w:tcMar>
+              <w:top w:w="50" w:type="dxa"/>
+              <w:bottom w:w="50" w:type="dxa"/>
+              <w:left w:w="90" w:type="dxa"/>
+              <w:right w:w="90" w:type="dxa"/>
+            </w:tcMar>
+          </w:tcPr>
+          <w:p>
+            <w:pPr>
+              <w:pStyle w:val="BDOITable"/>
+            </w:pPr>
+            <w:r>
+              <w:rPr>
+                <w:sz w:val="15"/>
+              </w:rPr>
+              <w:t>From the issue, in parallel with the review; re-issued with each version of the set</w:t>
+            </w:r>
+          </w:p>
+        </w:tc>
+      </w:tr>
+      <w:tr>
+        <w:tc>
+          <w:tcPr>
+            <w:tcW w:type="dxa" w:w="2946"/>
+            <w:tcMar>
+              <w:top w:w="50" w:type="dxa"/>
+              <w:bottom w:w="50" w:type="dxa"/>
+              <w:left w:w="90" w:type="dxa"/>
+              <w:right w:w="90" w:type="dxa"/>
+            </w:tcMar>
+            <w:shd w:val="clear" w:color="auto" w:fill="E5F5FF"/>
+          </w:tcPr>
+          <w:p>
+            <w:pPr>
+              <w:pStyle w:val="BDOITable"/>
+            </w:pPr>
+            <w:r>
+              <w:rPr>
+                <w:sz w:val="15"/>
+              </w:rPr>
+              <w:t>08_BIBS_UXScreens_BRD-01_New_Business_v2.0.xlsx</w:t>
+            </w:r>
+          </w:p>
+        </w:tc>
+        <w:tc>
+          <w:tcPr>
+            <w:tcW w:type="dxa" w:w="3626"/>
+            <w:tcMar>
+              <w:top w:w="50" w:type="dxa"/>
+              <w:bottom w:w="50" w:type="dxa"/>
+              <w:left w:w="90" w:type="dxa"/>
+              <w:right w:w="90" w:type="dxa"/>
+            </w:tcMar>
+            <w:shd w:val="clear" w:color="auto" w:fill="E5F5FF"/>
+          </w:tcPr>
+          <w:p>
+            <w:pPr>
+              <w:pStyle w:val="BDOITable"/>
+            </w:pPr>
+            <w:r>
+              <w:rPr>
+                <w:sz w:val="15"/>
+              </w:rPr>
+              <w:t>UX screen register: one row per screen image with the screen, personas, walkthrough and step, state, FRS section and requirements, UXD status and comments, and the Changed in this issue flag</w:t>
+            </w:r>
+          </w:p>
+        </w:tc>
+        <w:tc>
+          <w:tcPr>
+            <w:tcW w:type="dxa" w:w="1926"/>
+            <w:tcMar>
+              <w:top w:w="50" w:type="dxa"/>
+              <w:bottom w:w="50" w:type="dxa"/>
+              <w:left w:w="90" w:type="dxa"/>
+              <w:right w:w="90" w:type="dxa"/>
+            </w:tcMar>
+            <w:shd w:val="clear" w:color="auto" w:fill="E5F5FF"/>
+          </w:tcPr>
+          <w:p>
+            <w:pPr>
+              <w:pStyle w:val="BDOITable"/>
+            </w:pPr>
+            <w:r>
+              <w:rPr>
+                <w:sz w:val="15"/>
+              </w:rPr>
+              <w:t>BDOI UX Design team</w:t>
+            </w:r>
+          </w:p>
+        </w:tc>
+        <w:tc>
+          <w:tcPr>
+            <w:tcW w:type="dxa" w:w="1473"/>
+            <w:tcMar>
+              <w:top w:w="50" w:type="dxa"/>
+              <w:bottom w:w="50" w:type="dxa"/>
+              <w:left w:w="90" w:type="dxa"/>
+              <w:right w:w="90" w:type="dxa"/>
+            </w:tcMar>
+            <w:shd w:val="clear" w:color="auto" w:fill="E5F5FF"/>
+          </w:tcPr>
+          <w:p>
+            <w:pPr>
+              <w:pStyle w:val="BDOITable"/>
+            </w:pPr>
+            <w:r>
+              <w:rPr>
+                <w:sz w:val="15"/>
+              </w:rPr>
+              <w:t>Kept by the UX Design team; the changed rows are flagged at each issue</w:t>
+            </w:r>
+          </w:p>
+        </w:tc>
+      </w:tr>
+      <w:tr>
+        <w:tc>
+          <w:tcPr>
+            <w:tcW w:type="dxa" w:w="2946"/>
+            <w:tcMar>
+              <w:top w:w="50" w:type="dxa"/>
+              <w:bottom w:w="50" w:type="dxa"/>
+              <w:left w:w="90" w:type="dxa"/>
+              <w:right w:w="90" w:type="dxa"/>
+            </w:tcMar>
+          </w:tcPr>
+          <w:p>
+            <w:pPr>
+              <w:pStyle w:val="BDOITable"/>
+            </w:pPr>
+            <w:r>
+              <w:rPr>
+                <w:sz w:val="15"/>
+              </w:rPr>
+              <w:t>09_BIBS_UXScreens_BRD-01_New_Business_v2.0.zip</w:t>
+            </w:r>
+          </w:p>
+        </w:tc>
+        <w:tc>
+          <w:tcPr>
+            <w:tcW w:type="dxa" w:w="3626"/>
+            <w:tcMar>
+              <w:top w:w="50" w:type="dxa"/>
+              <w:bottom w:w="50" w:type="dxa"/>
+              <w:left w:w="90" w:type="dxa"/>
+              <w:right w:w="90" w:type="dxa"/>
+            </w:tcMar>
+          </w:tcPr>
+          <w:p>
+            <w:pPr>
+              <w:pStyle w:val="BDOITable"/>
+            </w:pPr>
+            <w:r>
+              <w:rPr>
+                <w:sz w:val="15"/>
+              </w:rPr>
+              <w:t>Image package: every screen image at twice the screen resolution (PNG) and the register as CSV</w:t>
+            </w:r>
+          </w:p>
+        </w:tc>
+        <w:tc>
+          <w:tcPr>
+            <w:tcW w:type="dxa" w:w="1926"/>
+            <w:tcMar>
+              <w:top w:w="50" w:type="dxa"/>
+              <w:bottom w:w="50" w:type="dxa"/>
+              <w:left w:w="90" w:type="dxa"/>
+              <w:right w:w="90" w:type="dxa"/>
+            </w:tcMar>
+          </w:tcPr>
+          <w:p>
+            <w:pPr>
+              <w:pStyle w:val="BDOITable"/>
+            </w:pPr>
+            <w:r>
+              <w:rPr>
+                <w:sz w:val="15"/>
+              </w:rPr>
+              <w:t>BDOI UX Design team</w:t>
+            </w:r>
+          </w:p>
+        </w:tc>
+        <w:tc>
+          <w:tcPr>
+            <w:tcW w:type="dxa" w:w="1473"/>
+            <w:tcMar>
+              <w:top w:w="50" w:type="dxa"/>
+              <w:bottom w:w="50" w:type="dxa"/>
+              <w:left w:w="90" w:type="dxa"/>
+              <w:right w:w="90" w:type="dxa"/>
+            </w:tcMar>
+          </w:tcPr>
+          <w:p>
+            <w:pPr>
+              <w:pStyle w:val="BDOITable"/>
+            </w:pPr>
+            <w:r>
+              <w:rPr>
+                <w:sz w:val="15"/>
+              </w:rPr>
+              <w:t>Imported into the design tool at each issue</w:t>
+            </w:r>
+          </w:p>
+        </w:tc>
+      </w:tr>
     </w:tbl>
     <w:p>
       <w:pPr>
@@ -2806,6 +3080,54 @@
                 <w:b/>
                 <w:sz w:val="16"/>
               </w:rPr>
+              <w:t>BDOI UX Design team</w:t>
+            </w:r>
+          </w:p>
+        </w:tc>
+        <w:tc>
+          <w:tcPr>
+            <w:tcW w:type="dxa" w:w="7592"/>
+            <w:tcMar>
+              <w:top w:w="50" w:type="dxa"/>
+              <w:bottom w:w="50" w:type="dxa"/>
+              <w:left w:w="90" w:type="dxa"/>
+              <w:right w:w="90" w:type="dxa"/>
+            </w:tcMar>
+            <w:shd w:val="clear" w:color="auto" w:fill="E5F5FF"/>
+          </w:tcPr>
+          <w:p>
+            <w:pPr>
+              <w:pStyle w:val="BDOITable"/>
+            </w:pPr>
+            <w:r>
+              <w:rPr>
+                <w:sz w:val="16"/>
+              </w:rPr>
+              <w:t>07 UX Screen Deck: design foundation and navigation first, then the personas, walkthroughs and screens of the design work; 08 UX screen register (filter Changed in this issue at each new issue); 09 image package in the design tool</w:t>
+            </w:r>
+          </w:p>
+        </w:tc>
+      </w:tr>
+      <w:tr>
+        <w:tc>
+          <w:tcPr>
+            <w:tcW w:type="dxa" w:w="2380"/>
+            <w:tcMar>
+              <w:top w:w="50" w:type="dxa"/>
+              <w:bottom w:w="50" w:type="dxa"/>
+              <w:left w:w="90" w:type="dxa"/>
+              <w:right w:w="90" w:type="dxa"/>
+            </w:tcMar>
+          </w:tcPr>
+          <w:p>
+            <w:pPr>
+              <w:pStyle w:val="BDOITable"/>
+            </w:pPr>
+            <w:r>
+              <w:rPr>
+                <w:b/>
+                <w:sz w:val="16"/>
+              </w:rPr>
               <w:t>iorta TechNXT project team</w:t>
             </w:r>
           </w:p>
@@ -2819,7 +3141,6 @@
               <w:left w:w="90" w:type="dxa"/>
               <w:right w:w="90" w:type="dxa"/>
             </w:tcMar>
-            <w:shd w:val="clear" w:color="auto" w:fill="E5F5FF"/>
           </w:tcPr>
           <w:p>
             <w:pPr>
@@ -2843,7 +3164,7 @@
     <w:p>
       <w:r>
         <w:rPr/>
-        <w:t>SIT users of the seed data for the review: ao and mkttl (Marketing), tsu (TSU), proc, proctl and epol (Processing), badmin (Business Administration). The passwords are sent separately to the named reviewers.</w:t>
+        <w:t>SIT users of the seed data for the review: ao and mkttl (Marketing), tsu and tsulead (TSU), proc, proctl and epol (Processing), approver (New Business Approver), adjust (Adjustment), badmin (Business Administration), admin (System Administrator) and auditor. The passwords are sent separately to the named reviewers.</w:t>
       </w:r>
     </w:p>
     <w:p>

</xml_diff>